<commit_message>
ia few little syntax things
</commit_message>
<xml_diff>
--- a/Doc/Directory-structure-for-examples-and-deployment-guide.docx
+++ b/Doc/Directory-structure-for-examples-and-deployment-guide.docx
@@ -70,8 +70,6 @@
       <w:r>
         <w:rPr>
           <w:rFonts w:ascii="Courier New" w:hAnsi="Courier New" w:cs="Courier New"/>
-          <w:sz w:val="22"/>
-          <w:szCs w:val="22"/>
         </w:rPr>
         <w:t>$CERTIFIER_ROOT/</w:t>
       </w:r>
@@ -79,8 +77,6 @@
       <w:r>
         <w:rPr>
           <w:rFonts w:ascii="Courier New" w:hAnsi="Courier New" w:cs="Courier New"/>
-          <w:sz w:val="22"/>
-          <w:szCs w:val="22"/>
         </w:rPr>
         <w:t>sample_apps</w:t>
       </w:r>
@@ -89,8 +85,6 @@
       <w:r>
         <w:rPr>
           <w:rFonts w:ascii="Courier New" w:hAnsi="Courier New" w:cs="Courier New"/>
-          <w:sz w:val="22"/>
-          <w:szCs w:val="22"/>
         </w:rPr>
         <w:t>/[</w:t>
       </w:r>
@@ -99,8 +93,6 @@
       <w:r>
         <w:rPr>
           <w:rFonts w:ascii="Courier New" w:hAnsi="Courier New" w:cs="Courier New"/>
-          <w:sz w:val="22"/>
-          <w:szCs w:val="22"/>
         </w:rPr>
         <w:t>simple_app</w:t>
       </w:r>
@@ -108,8 +100,6 @@
       <w:r>
         <w:rPr>
           <w:rFonts w:ascii="Courier New" w:hAnsi="Courier New" w:cs="Courier New"/>
-          <w:sz w:val="22"/>
-          <w:szCs w:val="22"/>
         </w:rPr>
         <w:t xml:space="preserve">, </w:t>
       </w:r>
@@ -117,8 +107,6 @@
       <w:r>
         <w:rPr>
           <w:rFonts w:ascii="Courier New" w:hAnsi="Courier New" w:cs="Courier New"/>
-          <w:sz w:val="22"/>
-          <w:szCs w:val="22"/>
         </w:rPr>
         <w:t>simple_app_for_sev</w:t>
       </w:r>
@@ -126,16 +114,12 @@
       <w:r>
         <w:rPr>
           <w:rFonts w:ascii="Courier New" w:hAnsi="Courier New" w:cs="Courier New"/>
-          <w:sz w:val="22"/>
-          <w:szCs w:val="22"/>
         </w:rPr>
         <w:t>, …</w:t>
       </w:r>
       <w:r>
         <w:rPr>
           <w:rFonts w:ascii="Courier New" w:hAnsi="Courier New" w:cs="Courier New"/>
-          <w:sz w:val="22"/>
-          <w:szCs w:val="22"/>
         </w:rPr>
         <w:t xml:space="preserve">]) </w:t>
       </w:r>
@@ -156,8 +140,6 @@
       <w:r>
         <w:rPr>
           <w:rFonts w:ascii="Courier New" w:hAnsi="Courier New" w:cs="Courier New"/>
-          <w:sz w:val="22"/>
-          <w:szCs w:val="22"/>
         </w:rPr>
         <w:t>$CERTIFIER_ROOT/</w:t>
       </w:r>
@@ -165,8 +147,6 @@
       <w:r>
         <w:rPr>
           <w:rFonts w:ascii="Courier New" w:hAnsi="Courier New" w:cs="Courier New"/>
-          <w:sz w:val="22"/>
-          <w:szCs w:val="22"/>
         </w:rPr>
         <w:t>vm_model_tools</w:t>
       </w:r>
@@ -174,8 +154,6 @@
       <w:r>
         <w:rPr>
           <w:rFonts w:ascii="Courier New" w:hAnsi="Courier New" w:cs="Courier New"/>
-          <w:sz w:val="22"/>
-          <w:szCs w:val="22"/>
         </w:rPr>
         <w:t>/example/scenario1</w:t>
       </w:r>
@@ -188,8 +166,6 @@
       <w:r>
         <w:rPr>
           <w:rFonts w:ascii="Courier New" w:hAnsi="Courier New" w:cs="Courier New"/>
-          <w:sz w:val="22"/>
-          <w:szCs w:val="22"/>
         </w:rPr>
         <w:t>$ENVIRONMENT_DIRECTORY</w:t>
       </w:r>
@@ -224,8 +200,6 @@
       <w:r>
         <w:rPr>
           <w:rFonts w:ascii="Courier New" w:hAnsi="Courier New" w:cs="Courier New"/>
-          <w:sz w:val="22"/>
-          <w:szCs w:val="22"/>
         </w:rPr>
         <w:t>$ENVIRONMENT_DIRECTORY</w:t>
       </w:r>
@@ -247,7 +221,19 @@
         <w:rPr>
           <w:rFonts w:ascii="Calibri" w:hAnsi="Calibri" w:cs="Calibri"/>
         </w:rPr>
-        <w:t xml:space="preserve"> use, one goal of this document is to separate what files and programs are required for each role and each real deployment.</w:t>
+        <w:t xml:space="preserve"> use, one goal of this document is to separate what files and programs are required for each role and </w:t>
+      </w:r>
+      <w:r>
+        <w:rPr>
+          <w:rFonts w:ascii="Calibri" w:hAnsi="Calibri" w:cs="Calibri"/>
+        </w:rPr>
+        <w:t>which are required in a</w:t>
+      </w:r>
+      <w:r>
+        <w:rPr>
+          <w:rFonts w:ascii="Calibri" w:hAnsi="Calibri" w:cs="Calibri"/>
+        </w:rPr>
+        <w:t xml:space="preserve"> real deployment.</w:t>
       </w:r>
     </w:p>
     <w:p>
@@ -300,15 +286,7 @@
           <w:i/>
           <w:iCs/>
         </w:rPr>
-        <w:t>Application developer:</w:t>
-      </w:r>
-      <w:r>
-        <w:rPr>
-          <w:rFonts w:ascii="Calibri" w:hAnsi="Calibri" w:cs="Calibri"/>
-          <w:i/>
-          <w:iCs/>
-        </w:rPr>
-        <w:t xml:space="preserve"> </w:t>
+        <w:t xml:space="preserve">Application developer: </w:t>
       </w:r>
       <w:r>
         <w:rPr>
@@ -462,8 +440,6 @@
       <w:r>
         <w:rPr>
           <w:rFonts w:ascii="Courier New" w:hAnsi="Courier New" w:cs="Courier New"/>
-          <w:sz w:val="22"/>
-          <w:szCs w:val="22"/>
         </w:rPr>
         <w:t>$ENVIRONMENT_DIRECTORY</w:t>
       </w:r>
@@ -476,8 +452,6 @@
       <w:r>
         <w:rPr>
           <w:rFonts w:ascii="Courier New" w:hAnsi="Courier New" w:cs="Courier New"/>
-          <w:sz w:val="22"/>
-          <w:szCs w:val="22"/>
         </w:rPr>
         <w:t>$ENVIRONMENT_DIRECTORY</w:t>
       </w:r>
@@ -552,16 +526,484 @@
       <w:r>
         <w:rPr>
           <w:rFonts w:ascii="Courier New" w:hAnsi="Courier New" w:cs="Courier New"/>
-          <w:sz w:val="22"/>
-          <w:szCs w:val="22"/>
+        </w:rPr>
+        <w:t xml:space="preserve">$ENVIRONMENT_DIRECTORY </w:t>
+      </w:r>
+      <w:r>
+        <w:rPr>
+          <w:rFonts w:ascii="Calibri" w:hAnsi="Calibri" w:cs="Calibri"/>
+        </w:rPr>
+        <w:t>from source files.  The developer includes the policy key certificate in the image</w:t>
+      </w:r>
+      <w:r>
+        <w:rPr>
+          <w:rFonts w:ascii="Calibri" w:hAnsi="Calibri" w:cs="Calibri"/>
+        </w:rPr>
+        <w:t xml:space="preserve"> to bind the policy to the app; this is obtained from the </w:t>
+      </w:r>
+      <w:r>
+        <w:rPr>
+          <w:rFonts w:ascii="Calibri" w:hAnsi="Calibri" w:cs="Calibri"/>
+          <w:i/>
+          <w:iCs/>
+        </w:rPr>
+        <w:t>Security domain administrator</w:t>
+      </w:r>
+      <w:r>
+        <w:rPr>
+          <w:rFonts w:ascii="Calibri" w:hAnsi="Calibri" w:cs="Calibri"/>
+        </w:rPr>
+        <w:t>.</w:t>
+      </w:r>
+    </w:p>
+    <w:p>
+      <w:pPr>
+        <w:spacing w:after="0" w:line="240" w:lineRule="auto"/>
+        <w:rPr>
+          <w:rFonts w:ascii="Calibri" w:hAnsi="Calibri" w:cs="Calibri"/>
+        </w:rPr>
+      </w:pPr>
+    </w:p>
+    <w:p>
+      <w:pPr>
+        <w:spacing w:after="0" w:line="240" w:lineRule="auto"/>
+        <w:rPr>
+          <w:rFonts w:ascii="Courier New" w:hAnsi="Courier New" w:cs="Courier New"/>
+        </w:rPr>
+      </w:pPr>
+      <w:r>
+        <w:rPr>
+          <w:rFonts w:ascii="Calibri" w:hAnsi="Calibri" w:cs="Calibri"/>
+        </w:rPr>
+        <w:t xml:space="preserve">The </w:t>
+      </w:r>
+      <w:r>
+        <w:rPr>
+          <w:rFonts w:ascii="Calibri" w:hAnsi="Calibri" w:cs="Calibri"/>
+          <w:i/>
+          <w:iCs/>
+        </w:rPr>
+        <w:t>Security domain administrator</w:t>
+      </w:r>
+      <w:r>
+        <w:rPr>
+          <w:rFonts w:ascii="Calibri" w:hAnsi="Calibri" w:cs="Calibri"/>
+        </w:rPr>
+        <w:t xml:space="preserve"> </w:t>
+      </w:r>
+      <w:r>
+        <w:rPr>
+          <w:rFonts w:ascii="Calibri" w:hAnsi="Calibri" w:cs="Calibri"/>
+        </w:rPr>
+        <w:t>generates key files</w:t>
+      </w:r>
+      <w:r>
+        <w:rPr>
+          <w:rFonts w:ascii="Calibri" w:hAnsi="Calibri" w:cs="Calibri"/>
+        </w:rPr>
+        <w:t>, certs</w:t>
+      </w:r>
+      <w:r>
+        <w:rPr>
+          <w:rFonts w:ascii="Calibri" w:hAnsi="Calibri" w:cs="Calibri"/>
+        </w:rPr>
+        <w:t xml:space="preserve"> and policy.  These files are stored in </w:t>
+      </w:r>
+      <w:r>
+        <w:rPr>
+          <w:rFonts w:ascii="Courier New" w:hAnsi="Courier New" w:cs="Courier New"/>
+        </w:rPr>
+        <w:t>$ENVIRONMENT_DIRECTORY/provisioning</w:t>
+      </w:r>
+      <w:r>
+        <w:rPr>
+          <w:rFonts w:ascii="Calibri" w:hAnsi="Calibri" w:cs="Calibri"/>
+        </w:rPr>
+        <w:t xml:space="preserve"> as they are generated.  When packaging for distribution to a deployed user or certifier service provider, the </w:t>
+      </w:r>
+      <w:r>
+        <w:rPr>
+          <w:rFonts w:ascii="Calibri" w:hAnsi="Calibri" w:cs="Calibri"/>
+          <w:i/>
+          <w:iCs/>
+        </w:rPr>
+        <w:t>Security domain administrator</w:t>
+      </w:r>
+      <w:r>
+        <w:rPr>
+          <w:rFonts w:ascii="Calibri" w:hAnsi="Calibri" w:cs="Calibri"/>
+        </w:rPr>
+        <w:t xml:space="preserve"> </w:t>
+      </w:r>
+      <w:r>
+        <w:rPr>
+          <w:rFonts w:ascii="Calibri" w:hAnsi="Calibri" w:cs="Calibri"/>
+        </w:rPr>
+        <w:lastRenderedPageBreak/>
+        <w:t xml:space="preserve">copies the files needed by the certifier service into </w:t>
+      </w:r>
+      <w:r>
+        <w:rPr>
+          <w:rFonts w:ascii="Courier New" w:hAnsi="Courier New" w:cs="Courier New"/>
+        </w:rPr>
+        <w:t>$ENVIRONMENT_DIRECTORY/service</w:t>
+      </w:r>
+      <w:r>
+        <w:rPr>
+          <w:rFonts w:ascii="Calibri" w:hAnsi="Calibri" w:cs="Calibri"/>
+        </w:rPr>
+        <w:t xml:space="preserve"> and the files needed by the deployed application into it</w:t>
+      </w:r>
+      <w:r>
+        <w:rPr>
+          <w:rFonts w:ascii="Calibri" w:hAnsi="Calibri" w:cs="Calibri"/>
+        </w:rPr>
+        <w:t>s</w:t>
+      </w:r>
+      <w:r>
+        <w:rPr>
+          <w:rFonts w:ascii="Calibri" w:hAnsi="Calibri" w:cs="Calibri"/>
+        </w:rPr>
+        <w:t xml:space="preserve"> application file directory, typically, </w:t>
+      </w:r>
+      <w:r>
+        <w:rPr>
+          <w:rFonts w:ascii="Courier New" w:hAnsi="Courier New" w:cs="Courier New"/>
+        </w:rPr>
+        <w:t>$ENVIRONMENT_DIRECTORY/</w:t>
+      </w:r>
+      <w:proofErr w:type="spellStart"/>
+      <w:r>
+        <w:rPr>
+          <w:rFonts w:ascii="Courier New" w:hAnsi="Courier New" w:cs="Courier New"/>
+        </w:rPr>
+        <w:t>app_data</w:t>
+      </w:r>
+      <w:proofErr w:type="spellEnd"/>
+      <w:r>
+        <w:rPr>
+          <w:rFonts w:ascii="Courier New" w:hAnsi="Courier New" w:cs="Courier New"/>
+        </w:rPr>
+        <w:t xml:space="preserve">. </w:t>
+      </w:r>
+    </w:p>
+    <w:p>
+      <w:pPr>
+        <w:spacing w:after="0" w:line="240" w:lineRule="auto"/>
+        <w:rPr>
+          <w:rFonts w:ascii="Courier New" w:hAnsi="Courier New" w:cs="Courier New"/>
+        </w:rPr>
+      </w:pPr>
+    </w:p>
+    <w:p>
+      <w:pPr>
+        <w:spacing w:after="0" w:line="240" w:lineRule="auto"/>
+        <w:rPr>
+          <w:rFonts w:ascii="Calibri" w:hAnsi="Calibri" w:cs="Calibri"/>
+        </w:rPr>
+      </w:pPr>
+      <w:r>
+        <w:rPr>
+          <w:rFonts w:ascii="Calibri" w:hAnsi="Calibri" w:cs="Calibri"/>
+        </w:rPr>
+        <w:t>Most of the application examples</w:t>
+      </w:r>
+      <w:r>
+        <w:rPr>
+          <w:rFonts w:ascii="Calibri" w:hAnsi="Calibri" w:cs="Calibri"/>
+        </w:rPr>
+        <w:t>,</w:t>
+      </w:r>
+      <w:r>
+        <w:rPr>
+          <w:rFonts w:ascii="Calibri" w:hAnsi="Calibri" w:cs="Calibri"/>
+        </w:rPr>
+        <w:t xml:space="preserve"> </w:t>
+      </w:r>
+      <w:proofErr w:type="gramStart"/>
+      <w:r>
+        <w:rPr>
+          <w:rFonts w:ascii="Calibri" w:hAnsi="Calibri" w:cs="Calibri"/>
+        </w:rPr>
+        <w:t>actually have</w:t>
+      </w:r>
+      <w:proofErr w:type="gramEnd"/>
+      <w:r>
+        <w:rPr>
+          <w:rFonts w:ascii="Calibri" w:hAnsi="Calibri" w:cs="Calibri"/>
+        </w:rPr>
+        <w:t xml:space="preserve"> two app directories, one for the app acting as a client for the example secure channel and one acting as the server for the example secure channel.  The </w:t>
+      </w:r>
+      <w:r>
+        <w:rPr>
+          <w:rFonts w:ascii="Calibri" w:hAnsi="Calibri" w:cs="Calibri"/>
+          <w:i/>
+          <w:iCs/>
+        </w:rPr>
+        <w:t>Security domain administrator</w:t>
+      </w:r>
+      <w:r>
+        <w:rPr>
+          <w:rFonts w:ascii="Calibri" w:hAnsi="Calibri" w:cs="Calibri"/>
+        </w:rPr>
+        <w:t xml:space="preserve"> only packages the application executable (which can be anywhere on the executable path but can reasonably remain in </w:t>
+      </w:r>
+      <w:r>
+        <w:rPr>
+          <w:rFonts w:ascii="Courier New" w:hAnsi="Courier New" w:cs="Courier New"/>
         </w:rPr>
         <w:t>$ENVIRONMENT_DIRECTORY</w:t>
       </w:r>
       <w:r>
         <w:rPr>
-          <w:rFonts w:ascii="Courier New" w:hAnsi="Courier New" w:cs="Courier New"/>
-          <w:sz w:val="22"/>
-          <w:szCs w:val="22"/>
+          <w:rFonts w:ascii="Calibri" w:hAnsi="Calibri" w:cs="Calibri"/>
+        </w:rPr>
+        <w:t xml:space="preserve">) and the </w:t>
+      </w:r>
+      <w:proofErr w:type="spellStart"/>
+      <w:r>
+        <w:rPr>
+          <w:rFonts w:ascii="Calibri" w:hAnsi="Calibri" w:cs="Calibri"/>
+          <w:i/>
+          <w:iCs/>
+        </w:rPr>
+        <w:t>app_data</w:t>
+      </w:r>
+      <w:proofErr w:type="spellEnd"/>
+      <w:r>
+        <w:rPr>
+          <w:rFonts w:ascii="Calibri" w:hAnsi="Calibri" w:cs="Calibri"/>
+        </w:rPr>
+        <w:t xml:space="preserve"> subdirectory which has some pre-determined files (like the simulated environment keys)</w:t>
+      </w:r>
+      <w:r>
+        <w:rPr>
+          <w:rStyle w:val="FootnoteReference"/>
+          <w:rFonts w:ascii="Calibri" w:hAnsi="Calibri" w:cs="Calibri"/>
+        </w:rPr>
+        <w:footnoteReference w:id="1"/>
+      </w:r>
+      <w:r>
+        <w:rPr>
+          <w:rFonts w:ascii="Calibri" w:hAnsi="Calibri" w:cs="Calibri"/>
+        </w:rPr>
+        <w:t>.  During installation</w:t>
+      </w:r>
+      <w:r>
+        <w:rPr>
+          <w:rFonts w:ascii="Calibri" w:hAnsi="Calibri" w:cs="Calibri"/>
+        </w:rPr>
+        <w:t xml:space="preserve"> and operation</w:t>
+      </w:r>
+      <w:r>
+        <w:rPr>
+          <w:rFonts w:ascii="Calibri" w:hAnsi="Calibri" w:cs="Calibri"/>
+        </w:rPr>
+        <w:t xml:space="preserve">, in the style of MAC application configuration, the </w:t>
+      </w:r>
+      <w:proofErr w:type="spellStart"/>
+      <w:r>
+        <w:rPr>
+          <w:rFonts w:ascii="Calibri" w:hAnsi="Calibri" w:cs="Calibri"/>
+          <w:i/>
+          <w:iCs/>
+        </w:rPr>
+        <w:t>app_data</w:t>
+      </w:r>
+      <w:proofErr w:type="spellEnd"/>
+      <w:r>
+        <w:rPr>
+          <w:rFonts w:ascii="Calibri" w:hAnsi="Calibri" w:cs="Calibri"/>
+        </w:rPr>
+        <w:t xml:space="preserve"> subdirectory will also get thing</w:t>
+      </w:r>
+      <w:r>
+        <w:rPr>
+          <w:rFonts w:ascii="Calibri" w:hAnsi="Calibri" w:cs="Calibri"/>
+        </w:rPr>
+        <w:t>s</w:t>
+      </w:r>
+      <w:r>
+        <w:rPr>
+          <w:rFonts w:ascii="Calibri" w:hAnsi="Calibri" w:cs="Calibri"/>
+        </w:rPr>
+        <w:t xml:space="preserve"> like machine certs, for example, the </w:t>
+      </w:r>
+      <w:r>
+        <w:rPr>
+          <w:rFonts w:ascii="Calibri" w:hAnsi="Calibri" w:cs="Calibri"/>
+        </w:rPr>
+        <w:t xml:space="preserve">ARK, ASK, and VCERT certs on </w:t>
+      </w:r>
+      <w:proofErr w:type="spellStart"/>
+      <w:r>
+        <w:rPr>
+          <w:rFonts w:ascii="Calibri" w:hAnsi="Calibri" w:cs="Calibri"/>
+        </w:rPr>
+        <w:t>sev</w:t>
+      </w:r>
+      <w:proofErr w:type="spellEnd"/>
+      <w:r>
+        <w:rPr>
+          <w:rFonts w:ascii="Calibri" w:hAnsi="Calibri" w:cs="Calibri"/>
+        </w:rPr>
+        <w:t>.</w:t>
+      </w:r>
+    </w:p>
+    <w:p>
+      <w:pPr>
+        <w:spacing w:after="0" w:line="240" w:lineRule="auto"/>
+        <w:rPr>
+          <w:rFonts w:ascii="Calibri" w:hAnsi="Calibri" w:cs="Calibri"/>
+        </w:rPr>
+      </w:pPr>
+    </w:p>
+    <w:p>
+      <w:pPr>
+        <w:spacing w:after="0" w:line="240" w:lineRule="auto"/>
+        <w:rPr>
+          <w:rFonts w:ascii="Calibri" w:hAnsi="Calibri" w:cs="Calibri"/>
+        </w:rPr>
+      </w:pPr>
+      <w:r>
+        <w:rPr>
+          <w:rFonts w:ascii="Calibri" w:hAnsi="Calibri" w:cs="Calibri"/>
+        </w:rPr>
+        <w:t xml:space="preserve">The files deployed to the </w:t>
+      </w:r>
+      <w:r>
+        <w:rPr>
+          <w:rFonts w:ascii="Calibri" w:hAnsi="Calibri" w:cs="Calibri"/>
+          <w:i/>
+          <w:iCs/>
+        </w:rPr>
+        <w:t xml:space="preserve">User in a deployed environment </w:t>
+      </w:r>
+      <w:r>
+        <w:rPr>
+          <w:rFonts w:ascii="Calibri" w:hAnsi="Calibri" w:cs="Calibri"/>
+        </w:rPr>
+        <w:t xml:space="preserve">never includes the files in the </w:t>
+      </w:r>
+      <w:r>
+        <w:rPr>
+          <w:rFonts w:ascii="Courier New" w:hAnsi="Courier New" w:cs="Courier New"/>
+        </w:rPr>
+        <w:t>$ENVIRONMENT_DIRECTORY/</w:t>
+      </w:r>
+      <w:r>
+        <w:rPr>
+          <w:rFonts w:ascii="Courier New" w:hAnsi="Courier New" w:cs="Courier New"/>
+        </w:rPr>
+        <w:t>provisioning</w:t>
+      </w:r>
+      <w:r>
+        <w:rPr>
+          <w:rFonts w:ascii="Calibri" w:hAnsi="Calibri" w:cs="Calibri"/>
+        </w:rPr>
+        <w:t xml:space="preserve"> directory or the </w:t>
+      </w:r>
+      <w:r>
+        <w:rPr>
+          <w:rFonts w:ascii="Courier New" w:hAnsi="Courier New" w:cs="Courier New"/>
+        </w:rPr>
+        <w:t>$ENVIRONMENT_DIRECTORY/service</w:t>
+      </w:r>
+      <w:r>
+        <w:rPr>
+          <w:rFonts w:ascii="Calibri" w:hAnsi="Calibri" w:cs="Calibri"/>
+        </w:rPr>
+        <w:t xml:space="preserve"> directory; indeed, these have unprotected versions of the private policy key and distributing them completely violates the security promise.  </w:t>
+      </w:r>
+    </w:p>
+    <w:p>
+      <w:pPr>
+        <w:spacing w:after="0" w:line="240" w:lineRule="auto"/>
+        <w:rPr>
+          <w:rFonts w:ascii="Calibri" w:hAnsi="Calibri" w:cs="Calibri"/>
+        </w:rPr>
+      </w:pPr>
+    </w:p>
+    <w:p>
+      <w:pPr>
+        <w:spacing w:after="0" w:line="240" w:lineRule="auto"/>
+        <w:rPr>
+          <w:rFonts w:ascii="Calibri" w:hAnsi="Calibri" w:cs="Calibri"/>
+        </w:rPr>
+      </w:pPr>
+      <w:r>
+        <w:rPr>
+          <w:rFonts w:ascii="Calibri" w:hAnsi="Calibri" w:cs="Calibri"/>
+        </w:rPr>
+        <w:t xml:space="preserve">The files in the </w:t>
+      </w:r>
+      <w:r>
+        <w:rPr>
+          <w:rFonts w:ascii="Courier New" w:hAnsi="Courier New" w:cs="Courier New"/>
+        </w:rPr>
+        <w:t xml:space="preserve">$ENVIRONMENT_DIRECTORY/service </w:t>
+      </w:r>
+      <w:r>
+        <w:rPr>
+          <w:rFonts w:ascii="Calibri" w:hAnsi="Calibri" w:cs="Calibri"/>
+        </w:rPr>
+        <w:t xml:space="preserve">are distributed to the </w:t>
+      </w:r>
+      <w:r>
+        <w:rPr>
+          <w:rFonts w:ascii="Calibri" w:hAnsi="Calibri" w:cs="Calibri"/>
+          <w:i/>
+          <w:iCs/>
+        </w:rPr>
+        <w:t>Certifier service provider</w:t>
+      </w:r>
+      <w:r>
+        <w:rPr>
+          <w:rFonts w:ascii="Calibri" w:hAnsi="Calibri" w:cs="Calibri"/>
+        </w:rPr>
+        <w:t xml:space="preserve">; optionally, the </w:t>
+      </w:r>
+      <w:r>
+        <w:rPr>
+          <w:rFonts w:ascii="Courier New" w:hAnsi="Courier New" w:cs="Courier New"/>
+        </w:rPr>
+        <w:t>$ENVIRONMENT_DIRECTORY</w:t>
+      </w:r>
+      <w:r>
+        <w:rPr>
+          <w:rFonts w:ascii="Calibri" w:hAnsi="Calibri" w:cs="Calibri"/>
+        </w:rPr>
+        <w:t xml:space="preserve"> may contain </w:t>
+      </w:r>
+      <w:proofErr w:type="spellStart"/>
+      <w:r>
+        <w:rPr>
+          <w:rFonts w:ascii="Calibri" w:hAnsi="Calibri" w:cs="Calibri"/>
+          <w:i/>
+          <w:iCs/>
+        </w:rPr>
+        <w:t>simpleserver</w:t>
+      </w:r>
+      <w:proofErr w:type="spellEnd"/>
+      <w:r>
+        <w:rPr>
+          <w:rFonts w:ascii="Calibri" w:hAnsi="Calibri" w:cs="Calibri"/>
+        </w:rPr>
+        <w:t xml:space="preserve">, but it need not provided </w:t>
+      </w:r>
+      <w:proofErr w:type="spellStart"/>
+      <w:r>
+        <w:rPr>
+          <w:rFonts w:ascii="Calibri" w:hAnsi="Calibri" w:cs="Calibri"/>
+          <w:i/>
+          <w:iCs/>
+        </w:rPr>
+        <w:t>simpleserver</w:t>
+      </w:r>
+      <w:proofErr w:type="spellEnd"/>
+      <w:r>
+        <w:rPr>
+          <w:rFonts w:ascii="Calibri" w:hAnsi="Calibri" w:cs="Calibri"/>
         </w:rPr>
         <w:t xml:space="preserve"> </w:t>
       </w:r>
@@ -569,63 +1011,51 @@
         <w:rPr>
           <w:rFonts w:ascii="Calibri" w:hAnsi="Calibri" w:cs="Calibri"/>
         </w:rPr>
-        <w:t>from source files.  The developer includes the policy key certificate in the image</w:t>
-      </w:r>
-      <w:r>
-        <w:rPr>
-          <w:rFonts w:ascii="Calibri" w:hAnsi="Calibri" w:cs="Calibri"/>
-        </w:rPr>
-        <w:t xml:space="preserve"> to bind the policy to the app; this is obtained from the </w:t>
-      </w:r>
-      <w:r>
-        <w:rPr>
-          <w:rFonts w:ascii="Calibri" w:hAnsi="Calibri" w:cs="Calibri"/>
-          <w:i/>
-          <w:iCs/>
-        </w:rPr>
-        <w:t>Security domain administrator</w:t>
-      </w:r>
-      <w:r>
-        <w:rPr>
-          <w:rFonts w:ascii="Calibri" w:hAnsi="Calibri" w:cs="Calibri"/>
-        </w:rPr>
-        <w:t>.</w:t>
-      </w:r>
-    </w:p>
-    <w:p>
-      <w:pPr>
-        <w:spacing w:after="0" w:line="240" w:lineRule="auto"/>
-        <w:rPr>
-          <w:rFonts w:ascii="Calibri" w:hAnsi="Calibri" w:cs="Calibri"/>
-        </w:rPr>
-      </w:pPr>
-    </w:p>
-    <w:p>
-      <w:pPr>
-        <w:spacing w:after="0" w:line="240" w:lineRule="auto"/>
-        <w:rPr>
-          <w:rFonts w:ascii="Courier New" w:hAnsi="Courier New" w:cs="Courier New"/>
-          <w:sz w:val="22"/>
-          <w:szCs w:val="22"/>
-        </w:rPr>
-      </w:pPr>
-      <w:r>
-        <w:rPr>
-          <w:rFonts w:ascii="Calibri" w:hAnsi="Calibri" w:cs="Calibri"/>
-        </w:rPr>
-        <w:t xml:space="preserve">The </w:t>
-      </w:r>
-      <w:r>
-        <w:rPr>
-          <w:rFonts w:ascii="Calibri" w:hAnsi="Calibri" w:cs="Calibri"/>
-          <w:i/>
-          <w:iCs/>
-        </w:rPr>
-        <w:t>Security domain administrator</w:t>
-      </w:r>
-      <w:r>
-        <w:rPr>
-          <w:rFonts w:ascii="Calibri" w:hAnsi="Calibri" w:cs="Calibri"/>
+        <w:t xml:space="preserve">is installed in some binary directory that can be accessed.  The </w:t>
+      </w:r>
+      <w:r>
+        <w:rPr>
+          <w:rFonts w:ascii="Calibri" w:hAnsi="Calibri" w:cs="Calibri"/>
+          <w:i/>
+          <w:iCs/>
+        </w:rPr>
+        <w:t xml:space="preserve">Certifier service provider </w:t>
+      </w:r>
+      <w:r>
+        <w:rPr>
+          <w:rFonts w:ascii="Calibri" w:hAnsi="Calibri" w:cs="Calibri"/>
+        </w:rPr>
+        <w:t xml:space="preserve">should not receive the </w:t>
+      </w:r>
+      <w:r>
+        <w:rPr>
+          <w:rFonts w:ascii="Courier New" w:hAnsi="Courier New" w:cs="Courier New"/>
+        </w:rPr>
+        <w:t>$ENVIRONMENT_DIRECTORY/</w:t>
+      </w:r>
+      <w:proofErr w:type="spellStart"/>
+      <w:r>
+        <w:rPr>
+          <w:rFonts w:ascii="Courier New" w:hAnsi="Courier New" w:cs="Courier New"/>
+        </w:rPr>
+        <w:t>app_data</w:t>
+      </w:r>
+      <w:proofErr w:type="spellEnd"/>
+      <w:r>
+        <w:rPr>
+          <w:rFonts w:ascii="Calibri" w:hAnsi="Calibri" w:cs="Calibri"/>
+        </w:rPr>
+        <w:t xml:space="preserve"> or the </w:t>
+      </w:r>
+      <w:r>
+        <w:rPr>
+          <w:rFonts w:ascii="Courier New" w:hAnsi="Courier New" w:cs="Courier New"/>
+        </w:rPr>
+        <w:t>$ENVIRONMENT_DIRECTORY/provisioning</w:t>
+      </w:r>
+      <w:r>
+        <w:rPr>
+          <w:rFonts w:ascii="Courier New" w:hAnsi="Courier New" w:cs="Courier New"/>
         </w:rPr>
         <w:t xml:space="preserve"> </w:t>
       </w:r>
@@ -633,718 +1063,142 @@
         <w:rPr>
           <w:rFonts w:ascii="Calibri" w:hAnsi="Calibri" w:cs="Calibri"/>
         </w:rPr>
-        <w:t>generates key files</w:t>
-      </w:r>
-      <w:r>
-        <w:rPr>
-          <w:rFonts w:ascii="Calibri" w:hAnsi="Calibri" w:cs="Calibri"/>
-        </w:rPr>
-        <w:t>, certs</w:t>
-      </w:r>
-      <w:r>
-        <w:rPr>
-          <w:rFonts w:ascii="Calibri" w:hAnsi="Calibri" w:cs="Calibri"/>
-        </w:rPr>
-        <w:t xml:space="preserve"> and policy.  These files are stored in </w:t>
-      </w:r>
-      <w:r>
-        <w:rPr>
-          <w:rFonts w:ascii="Courier New" w:hAnsi="Courier New" w:cs="Courier New"/>
-          <w:sz w:val="22"/>
-          <w:szCs w:val="22"/>
+        <w:t>directories.</w:t>
+      </w:r>
+    </w:p>
+    <w:p>
+      <w:pPr>
+        <w:spacing w:after="0" w:line="240" w:lineRule="auto"/>
+        <w:rPr>
+          <w:rFonts w:ascii="Calibri" w:hAnsi="Calibri" w:cs="Calibri"/>
+        </w:rPr>
+      </w:pPr>
+    </w:p>
+    <w:p>
+      <w:pPr>
+        <w:spacing w:after="0" w:line="240" w:lineRule="auto"/>
+        <w:rPr>
+          <w:rFonts w:ascii="Calibri" w:hAnsi="Calibri" w:cs="Calibri"/>
+        </w:rPr>
+      </w:pPr>
+      <w:r>
+        <w:rPr>
+          <w:rFonts w:ascii="Calibri" w:hAnsi="Calibri" w:cs="Calibri"/>
+        </w:rPr>
+        <w:t>Th</w:t>
+      </w:r>
+      <w:r>
+        <w:rPr>
+          <w:rFonts w:ascii="Calibri" w:hAnsi="Calibri" w:cs="Calibri"/>
+        </w:rPr>
+        <w:t xml:space="preserve">e deployment package for the </w:t>
+      </w:r>
+      <w:r>
+        <w:rPr>
+          <w:rFonts w:ascii="Calibri" w:hAnsi="Calibri" w:cs="Calibri"/>
+          <w:i/>
+          <w:iCs/>
+        </w:rPr>
+        <w:t xml:space="preserve">User in a deployed environment </w:t>
+      </w:r>
+      <w:r>
+        <w:rPr>
+          <w:rFonts w:ascii="Calibri" w:hAnsi="Calibri" w:cs="Calibri"/>
+        </w:rPr>
+        <w:t>can place the executable</w:t>
+      </w:r>
+      <w:r>
+        <w:rPr>
+          <w:rFonts w:ascii="Calibri" w:hAnsi="Calibri" w:cs="Calibri"/>
+        </w:rPr>
+        <w:t>s</w:t>
+      </w:r>
+      <w:r>
+        <w:rPr>
+          <w:rFonts w:ascii="Calibri" w:hAnsi="Calibri" w:cs="Calibri"/>
+        </w:rPr>
+        <w:t xml:space="preserve"> anywhere but </w:t>
+      </w:r>
+      <w:r>
+        <w:rPr>
+          <w:rFonts w:ascii="Courier New" w:hAnsi="Courier New" w:cs="Courier New"/>
         </w:rPr>
         <w:t>$ENVIRONMENT_DIRECTORY</w:t>
       </w:r>
       <w:r>
         <w:rPr>
-          <w:rFonts w:ascii="Courier New" w:hAnsi="Courier New" w:cs="Courier New"/>
-          <w:sz w:val="22"/>
-          <w:szCs w:val="22"/>
-        </w:rPr>
-        <w:t>/provisioning</w:t>
-      </w:r>
-      <w:r>
-        <w:rPr>
-          <w:rFonts w:ascii="Calibri" w:hAnsi="Calibri" w:cs="Calibri"/>
-        </w:rPr>
-        <w:t xml:space="preserve"> as they are generated.  When packaging for distribution to a deployed user or certifier service provider, the </w:t>
-      </w:r>
-      <w:r>
-        <w:rPr>
-          <w:rFonts w:ascii="Calibri" w:hAnsi="Calibri" w:cs="Calibri"/>
-          <w:i/>
-          <w:iCs/>
-        </w:rPr>
-        <w:t>Security domain administrator</w:t>
-      </w:r>
-      <w:r>
-        <w:rPr>
-          <w:rFonts w:ascii="Calibri" w:hAnsi="Calibri" w:cs="Calibri"/>
-        </w:rPr>
-        <w:t xml:space="preserve"> copies the files needed by the certifier service into </w:t>
-      </w:r>
-      <w:r>
-        <w:rPr>
-          <w:rFonts w:ascii="Courier New" w:hAnsi="Courier New" w:cs="Courier New"/>
-          <w:sz w:val="22"/>
-          <w:szCs w:val="22"/>
+          <w:rFonts w:ascii="Calibri" w:hAnsi="Calibri" w:cs="Calibri"/>
+        </w:rPr>
+        <w:t xml:space="preserve"> is a convenient place.  During certification, </w:t>
+      </w:r>
+      <w:r>
+        <w:rPr>
+          <w:rFonts w:ascii="Courier New" w:hAnsi="Courier New" w:cs="Courier New"/>
+        </w:rPr>
+        <w:t>$ENVIRONMENT_DIRECTORY/</w:t>
+      </w:r>
+      <w:proofErr w:type="spellStart"/>
+      <w:r>
+        <w:rPr>
+          <w:rFonts w:ascii="Courier New" w:hAnsi="Courier New" w:cs="Courier New"/>
+        </w:rPr>
+        <w:t>app_data</w:t>
+      </w:r>
+      <w:proofErr w:type="spellEnd"/>
+      <w:r>
+        <w:rPr>
+          <w:rFonts w:ascii="Calibri" w:hAnsi="Calibri" w:cs="Calibri"/>
+        </w:rPr>
+        <w:t xml:space="preserve"> will contain the policy-store</w:t>
+      </w:r>
+      <w:r>
+        <w:rPr>
+          <w:rFonts w:ascii="Calibri" w:hAnsi="Calibri" w:cs="Calibri"/>
+        </w:rPr>
+        <w:t>,</w:t>
+      </w:r>
+      <w:r>
+        <w:rPr>
+          <w:rFonts w:ascii="Calibri" w:hAnsi="Calibri" w:cs="Calibri"/>
+        </w:rPr>
+        <w:t xml:space="preserve"> which protects application specific information in encry</w:t>
+      </w:r>
+      <w:r>
+        <w:rPr>
+          <w:rFonts w:ascii="Calibri" w:hAnsi="Calibri" w:cs="Calibri"/>
+        </w:rPr>
+        <w:t>pted form.</w:t>
+      </w:r>
+    </w:p>
+    <w:p>
+      <w:pPr>
+        <w:spacing w:after="0" w:line="240" w:lineRule="auto"/>
+        <w:rPr>
+          <w:rFonts w:ascii="Calibri" w:hAnsi="Calibri" w:cs="Calibri"/>
+        </w:rPr>
+      </w:pPr>
+    </w:p>
+    <w:p>
+      <w:pPr>
+        <w:spacing w:after="0" w:line="240" w:lineRule="auto"/>
+        <w:rPr>
+          <w:rFonts w:ascii="Calibri" w:hAnsi="Calibri" w:cs="Calibri"/>
+        </w:rPr>
+      </w:pPr>
+      <w:r>
+        <w:rPr>
+          <w:rFonts w:ascii="Calibri" w:hAnsi="Calibri" w:cs="Calibri"/>
+        </w:rPr>
+        <w:t xml:space="preserve">As a reminder, as deployed, the </w:t>
+      </w:r>
+      <w:r>
+        <w:rPr>
+          <w:rFonts w:ascii="Courier New" w:hAnsi="Courier New" w:cs="Courier New"/>
         </w:rPr>
         <w:t>$ENVIRONMENT_DIRECTORY</w:t>
       </w:r>
       <w:r>
         <w:rPr>
-          <w:rFonts w:ascii="Courier New" w:hAnsi="Courier New" w:cs="Courier New"/>
-          <w:sz w:val="22"/>
-          <w:szCs w:val="22"/>
-        </w:rPr>
-        <w:t>/service</w:t>
-      </w:r>
-      <w:r>
-        <w:rPr>
-          <w:rFonts w:ascii="Calibri" w:hAnsi="Calibri" w:cs="Calibri"/>
-        </w:rPr>
-        <w:t xml:space="preserve"> and </w:t>
-      </w:r>
-      <w:r>
-        <w:rPr>
-          <w:rFonts w:ascii="Calibri" w:hAnsi="Calibri" w:cs="Calibri"/>
-        </w:rPr>
-        <w:lastRenderedPageBreak/>
-        <w:t>the files needed by the deployed application into it</w:t>
-      </w:r>
-      <w:r>
-        <w:rPr>
-          <w:rFonts w:ascii="Calibri" w:hAnsi="Calibri" w:cs="Calibri"/>
-        </w:rPr>
-        <w:t>s</w:t>
-      </w:r>
-      <w:r>
-        <w:rPr>
-          <w:rFonts w:ascii="Calibri" w:hAnsi="Calibri" w:cs="Calibri"/>
-        </w:rPr>
-        <w:t xml:space="preserve"> application file directory, typically, </w:t>
-      </w:r>
-      <w:r>
-        <w:rPr>
-          <w:rFonts w:ascii="Courier New" w:hAnsi="Courier New" w:cs="Courier New"/>
-          <w:sz w:val="22"/>
-          <w:szCs w:val="22"/>
-        </w:rPr>
-        <w:t>$ENVIRONMENT_DIRECTORY</w:t>
-      </w:r>
-      <w:r>
-        <w:rPr>
-          <w:rFonts w:ascii="Courier New" w:hAnsi="Courier New" w:cs="Courier New"/>
-          <w:sz w:val="22"/>
-          <w:szCs w:val="22"/>
-        </w:rPr>
-        <w:t>/</w:t>
-      </w:r>
-      <w:proofErr w:type="spellStart"/>
-      <w:r>
-        <w:rPr>
-          <w:rFonts w:ascii="Courier New" w:hAnsi="Courier New" w:cs="Courier New"/>
-          <w:sz w:val="22"/>
-          <w:szCs w:val="22"/>
-        </w:rPr>
-        <w:t>app_data</w:t>
-      </w:r>
-      <w:proofErr w:type="spellEnd"/>
-      <w:r>
-        <w:rPr>
-          <w:rFonts w:ascii="Courier New" w:hAnsi="Courier New" w:cs="Courier New"/>
-          <w:sz w:val="22"/>
-          <w:szCs w:val="22"/>
-        </w:rPr>
-        <w:t xml:space="preserve">. </w:t>
-      </w:r>
-    </w:p>
-    <w:p>
-      <w:pPr>
-        <w:spacing w:after="0" w:line="240" w:lineRule="auto"/>
-        <w:rPr>
-          <w:rFonts w:ascii="Courier New" w:hAnsi="Courier New" w:cs="Courier New"/>
-          <w:sz w:val="22"/>
-          <w:szCs w:val="22"/>
-        </w:rPr>
-      </w:pPr>
-    </w:p>
-    <w:p>
-      <w:pPr>
-        <w:spacing w:after="0" w:line="240" w:lineRule="auto"/>
-        <w:rPr>
-          <w:rFonts w:ascii="Calibri" w:hAnsi="Calibri" w:cs="Calibri"/>
-        </w:rPr>
-      </w:pPr>
-      <w:r>
-        <w:rPr>
-          <w:rFonts w:ascii="Calibri" w:hAnsi="Calibri" w:cs="Calibri"/>
-        </w:rPr>
-        <w:t>Most of the application examples</w:t>
-      </w:r>
-      <w:r>
-        <w:rPr>
-          <w:rFonts w:ascii="Calibri" w:hAnsi="Calibri" w:cs="Calibri"/>
-        </w:rPr>
-        <w:t>,</w:t>
-      </w:r>
-      <w:r>
-        <w:rPr>
-          <w:rFonts w:ascii="Calibri" w:hAnsi="Calibri" w:cs="Calibri"/>
-        </w:rPr>
-        <w:t xml:space="preserve"> </w:t>
-      </w:r>
-      <w:proofErr w:type="gramStart"/>
-      <w:r>
-        <w:rPr>
-          <w:rFonts w:ascii="Calibri" w:hAnsi="Calibri" w:cs="Calibri"/>
-        </w:rPr>
-        <w:t>actually have</w:t>
-      </w:r>
-      <w:proofErr w:type="gramEnd"/>
-      <w:r>
-        <w:rPr>
-          <w:rFonts w:ascii="Calibri" w:hAnsi="Calibri" w:cs="Calibri"/>
-        </w:rPr>
-        <w:t xml:space="preserve"> two app directories, one for the app acting as a client for the example secure channel and one acting as the server for the example secure channel.  The </w:t>
-      </w:r>
-      <w:r>
-        <w:rPr>
-          <w:rFonts w:ascii="Calibri" w:hAnsi="Calibri" w:cs="Calibri"/>
-          <w:i/>
-          <w:iCs/>
-        </w:rPr>
-        <w:t>Security domain administrator</w:t>
-      </w:r>
-      <w:r>
-        <w:rPr>
-          <w:rFonts w:ascii="Calibri" w:hAnsi="Calibri" w:cs="Calibri"/>
-        </w:rPr>
-        <w:t xml:space="preserve"> only packages the application executable (which can be anywhere on the executable path but can reasonably remain in </w:t>
-      </w:r>
-      <w:r>
-        <w:rPr>
-          <w:rFonts w:ascii="Courier New" w:hAnsi="Courier New" w:cs="Courier New"/>
-          <w:sz w:val="22"/>
-          <w:szCs w:val="22"/>
-        </w:rPr>
-        <w:t>$ENVIRONMENT_DIRECTORY</w:t>
-      </w:r>
-      <w:r>
-        <w:rPr>
-          <w:rFonts w:ascii="Calibri" w:hAnsi="Calibri" w:cs="Calibri"/>
-        </w:rPr>
-        <w:t xml:space="preserve">) and the </w:t>
-      </w:r>
-      <w:proofErr w:type="spellStart"/>
-      <w:r>
-        <w:rPr>
-          <w:rFonts w:ascii="Calibri" w:hAnsi="Calibri" w:cs="Calibri"/>
-          <w:i/>
-          <w:iCs/>
-        </w:rPr>
-        <w:t>app_data</w:t>
-      </w:r>
-      <w:proofErr w:type="spellEnd"/>
-      <w:r>
-        <w:rPr>
-          <w:rFonts w:ascii="Calibri" w:hAnsi="Calibri" w:cs="Calibri"/>
-        </w:rPr>
-        <w:t xml:space="preserve"> subdirectory which has some pre-determined files (like the simulated environment keys)</w:t>
-      </w:r>
-      <w:r>
-        <w:rPr>
-          <w:rStyle w:val="FootnoteReference"/>
-          <w:rFonts w:ascii="Calibri" w:hAnsi="Calibri" w:cs="Calibri"/>
-        </w:rPr>
-        <w:footnoteReference w:id="1"/>
-      </w:r>
-      <w:r>
-        <w:rPr>
-          <w:rFonts w:ascii="Calibri" w:hAnsi="Calibri" w:cs="Calibri"/>
-        </w:rPr>
-        <w:t>.  During installation</w:t>
-      </w:r>
-      <w:r>
-        <w:rPr>
-          <w:rFonts w:ascii="Calibri" w:hAnsi="Calibri" w:cs="Calibri"/>
-        </w:rPr>
-        <w:t xml:space="preserve"> and operation</w:t>
-      </w:r>
-      <w:r>
-        <w:rPr>
-          <w:rFonts w:ascii="Calibri" w:hAnsi="Calibri" w:cs="Calibri"/>
-        </w:rPr>
-        <w:t xml:space="preserve">, in the style of MAC application configuration, the </w:t>
-      </w:r>
-      <w:proofErr w:type="spellStart"/>
-      <w:r>
-        <w:rPr>
-          <w:rFonts w:ascii="Calibri" w:hAnsi="Calibri" w:cs="Calibri"/>
-          <w:i/>
-          <w:iCs/>
-        </w:rPr>
-        <w:t>app_data</w:t>
-      </w:r>
-      <w:proofErr w:type="spellEnd"/>
-      <w:r>
-        <w:rPr>
-          <w:rFonts w:ascii="Calibri" w:hAnsi="Calibri" w:cs="Calibri"/>
-        </w:rPr>
-        <w:t xml:space="preserve"> subdirectory will also get thing</w:t>
-      </w:r>
-      <w:r>
-        <w:rPr>
-          <w:rFonts w:ascii="Calibri" w:hAnsi="Calibri" w:cs="Calibri"/>
-        </w:rPr>
-        <w:t>s</w:t>
-      </w:r>
-      <w:r>
-        <w:rPr>
-          <w:rFonts w:ascii="Calibri" w:hAnsi="Calibri" w:cs="Calibri"/>
-        </w:rPr>
-        <w:t xml:space="preserve"> like machine certs, for example, the </w:t>
-      </w:r>
-      <w:r>
-        <w:rPr>
-          <w:rFonts w:ascii="Calibri" w:hAnsi="Calibri" w:cs="Calibri"/>
-        </w:rPr>
-        <w:t xml:space="preserve">ARK, ASK, and VCERT certs on </w:t>
-      </w:r>
-      <w:proofErr w:type="spellStart"/>
-      <w:r>
-        <w:rPr>
-          <w:rFonts w:ascii="Calibri" w:hAnsi="Calibri" w:cs="Calibri"/>
-        </w:rPr>
-        <w:t>sev.</w:t>
-      </w:r>
-      <w:proofErr w:type="spellEnd"/>
-    </w:p>
-    <w:p>
-      <w:pPr>
-        <w:spacing w:after="0" w:line="240" w:lineRule="auto"/>
-        <w:rPr>
-          <w:rFonts w:ascii="Calibri" w:hAnsi="Calibri" w:cs="Calibri"/>
-        </w:rPr>
-      </w:pPr>
-    </w:p>
-    <w:p>
-      <w:pPr>
-        <w:spacing w:after="0" w:line="240" w:lineRule="auto"/>
-        <w:rPr>
-          <w:rFonts w:ascii="Calibri" w:hAnsi="Calibri" w:cs="Calibri"/>
-        </w:rPr>
-      </w:pPr>
-      <w:r>
-        <w:rPr>
-          <w:rFonts w:ascii="Calibri" w:hAnsi="Calibri" w:cs="Calibri"/>
-        </w:rPr>
-        <w:t xml:space="preserve">The files deployed to the </w:t>
-      </w:r>
-      <w:r>
-        <w:rPr>
-          <w:rFonts w:ascii="Calibri" w:hAnsi="Calibri" w:cs="Calibri"/>
-          <w:i/>
-          <w:iCs/>
-        </w:rPr>
-        <w:t>User in a deployed environment</w:t>
-      </w:r>
-      <w:r>
-        <w:rPr>
-          <w:rFonts w:ascii="Calibri" w:hAnsi="Calibri" w:cs="Calibri"/>
-          <w:i/>
-          <w:iCs/>
-        </w:rPr>
-        <w:t xml:space="preserve"> </w:t>
-      </w:r>
-      <w:r>
-        <w:rPr>
-          <w:rFonts w:ascii="Calibri" w:hAnsi="Calibri" w:cs="Calibri"/>
-        </w:rPr>
-        <w:t xml:space="preserve">never includes the files in the </w:t>
-      </w:r>
-      <w:r>
-        <w:rPr>
-          <w:rFonts w:ascii="Courier New" w:hAnsi="Courier New" w:cs="Courier New"/>
-          <w:sz w:val="22"/>
-          <w:szCs w:val="22"/>
-        </w:rPr>
-        <w:t>$ENVIRONMENT_DIRECTORY</w:t>
-      </w:r>
-      <w:r>
-        <w:rPr>
-          <w:rFonts w:ascii="Courier New" w:hAnsi="Courier New" w:cs="Courier New"/>
-          <w:sz w:val="22"/>
-          <w:szCs w:val="22"/>
-        </w:rPr>
-        <w:t>/</w:t>
-      </w:r>
-      <w:r>
-        <w:rPr>
-          <w:rFonts w:ascii="Courier New" w:hAnsi="Courier New" w:cs="Courier New"/>
-          <w:sz w:val="22"/>
-          <w:szCs w:val="22"/>
-        </w:rPr>
-        <w:t>provisioning</w:t>
-      </w:r>
-      <w:r>
-        <w:rPr>
-          <w:rFonts w:ascii="Calibri" w:hAnsi="Calibri" w:cs="Calibri"/>
-        </w:rPr>
-        <w:t xml:space="preserve"> directory or the </w:t>
-      </w:r>
-      <w:r>
-        <w:rPr>
-          <w:rFonts w:ascii="Courier New" w:hAnsi="Courier New" w:cs="Courier New"/>
-          <w:sz w:val="22"/>
-          <w:szCs w:val="22"/>
-        </w:rPr>
-        <w:t>$ENVIRONMENT_DIRECTORY</w:t>
-      </w:r>
-      <w:r>
-        <w:rPr>
-          <w:rFonts w:ascii="Courier New" w:hAnsi="Courier New" w:cs="Courier New"/>
-          <w:sz w:val="22"/>
-          <w:szCs w:val="22"/>
-        </w:rPr>
-        <w:t>/service</w:t>
-      </w:r>
-      <w:r>
-        <w:rPr>
-          <w:rFonts w:ascii="Calibri" w:hAnsi="Calibri" w:cs="Calibri"/>
-        </w:rPr>
-        <w:t xml:space="preserve"> directory; indeed, these have unprotected versions of the private policy key and distributing them completely violates the security promise.  </w:t>
-      </w:r>
-    </w:p>
-    <w:p>
-      <w:pPr>
-        <w:spacing w:after="0" w:line="240" w:lineRule="auto"/>
-        <w:rPr>
-          <w:rFonts w:ascii="Calibri" w:hAnsi="Calibri" w:cs="Calibri"/>
-        </w:rPr>
-      </w:pPr>
-    </w:p>
-    <w:p>
-      <w:pPr>
-        <w:spacing w:after="0" w:line="240" w:lineRule="auto"/>
-        <w:rPr>
-          <w:rFonts w:ascii="Calibri" w:hAnsi="Calibri" w:cs="Calibri"/>
-        </w:rPr>
-      </w:pPr>
-      <w:r>
-        <w:rPr>
-          <w:rFonts w:ascii="Calibri" w:hAnsi="Calibri" w:cs="Calibri"/>
-        </w:rPr>
-        <w:t xml:space="preserve">The files in the </w:t>
-      </w:r>
-      <w:r>
-        <w:rPr>
-          <w:rFonts w:ascii="Courier New" w:hAnsi="Courier New" w:cs="Courier New"/>
-          <w:sz w:val="22"/>
-          <w:szCs w:val="22"/>
-        </w:rPr>
-        <w:t>$ENVIRONMENT_DIRECTORY</w:t>
-      </w:r>
-      <w:r>
-        <w:rPr>
-          <w:rFonts w:ascii="Courier New" w:hAnsi="Courier New" w:cs="Courier New"/>
-          <w:sz w:val="22"/>
-          <w:szCs w:val="22"/>
-        </w:rPr>
-        <w:t xml:space="preserve">/service </w:t>
-      </w:r>
-      <w:r>
-        <w:rPr>
-          <w:rFonts w:ascii="Calibri" w:hAnsi="Calibri" w:cs="Calibri"/>
-        </w:rPr>
-        <w:t xml:space="preserve">are distributed to the </w:t>
-      </w:r>
-      <w:r>
-        <w:rPr>
-          <w:rFonts w:ascii="Calibri" w:hAnsi="Calibri" w:cs="Calibri"/>
-          <w:i/>
-          <w:iCs/>
-        </w:rPr>
-        <w:t>Certifier service provider</w:t>
-      </w:r>
-      <w:r>
-        <w:rPr>
-          <w:rFonts w:ascii="Calibri" w:hAnsi="Calibri" w:cs="Calibri"/>
-        </w:rPr>
-        <w:t xml:space="preserve">; optionally, the </w:t>
-      </w:r>
-      <w:r>
-        <w:rPr>
-          <w:rFonts w:ascii="Courier New" w:hAnsi="Courier New" w:cs="Courier New"/>
-          <w:sz w:val="22"/>
-          <w:szCs w:val="22"/>
-        </w:rPr>
-        <w:t>$ENVIRONMENT_DIRECTORY</w:t>
-      </w:r>
-      <w:r>
-        <w:rPr>
-          <w:rFonts w:ascii="Calibri" w:hAnsi="Calibri" w:cs="Calibri"/>
-        </w:rPr>
-        <w:t xml:space="preserve"> may contain </w:t>
-      </w:r>
-      <w:proofErr w:type="spellStart"/>
-      <w:r>
-        <w:rPr>
-          <w:rFonts w:ascii="Calibri" w:hAnsi="Calibri" w:cs="Calibri"/>
-          <w:i/>
-          <w:iCs/>
-        </w:rPr>
-        <w:t>simpleserver</w:t>
-      </w:r>
-      <w:proofErr w:type="spellEnd"/>
-      <w:r>
-        <w:rPr>
-          <w:rFonts w:ascii="Calibri" w:hAnsi="Calibri" w:cs="Calibri"/>
-        </w:rPr>
-        <w:t xml:space="preserve">, but it need not provided </w:t>
-      </w:r>
-      <w:proofErr w:type="spellStart"/>
-      <w:r>
-        <w:rPr>
-          <w:rFonts w:ascii="Calibri" w:hAnsi="Calibri" w:cs="Calibri"/>
-          <w:i/>
-          <w:iCs/>
-        </w:rPr>
-        <w:t>simpleserver</w:t>
-      </w:r>
-      <w:proofErr w:type="spellEnd"/>
-      <w:r>
-        <w:rPr>
-          <w:rFonts w:ascii="Calibri" w:hAnsi="Calibri" w:cs="Calibri"/>
-        </w:rPr>
-        <w:t xml:space="preserve"> </w:t>
-      </w:r>
-      <w:r>
-        <w:rPr>
-          <w:rFonts w:ascii="Calibri" w:hAnsi="Calibri" w:cs="Calibri"/>
-        </w:rPr>
-        <w:t xml:space="preserve">is installed in some binary directory that can be accessed.  The </w:t>
-      </w:r>
-      <w:r>
-        <w:rPr>
-          <w:rFonts w:ascii="Calibri" w:hAnsi="Calibri" w:cs="Calibri"/>
-          <w:i/>
-          <w:iCs/>
-        </w:rPr>
-        <w:t>Certifier service provider</w:t>
-      </w:r>
-      <w:r>
-        <w:rPr>
-          <w:rFonts w:ascii="Calibri" w:hAnsi="Calibri" w:cs="Calibri"/>
-          <w:i/>
-          <w:iCs/>
-        </w:rPr>
-        <w:t xml:space="preserve"> </w:t>
-      </w:r>
-      <w:r>
-        <w:rPr>
-          <w:rFonts w:ascii="Calibri" w:hAnsi="Calibri" w:cs="Calibri"/>
-        </w:rPr>
-        <w:t xml:space="preserve">should not receive the </w:t>
-      </w:r>
-      <w:r>
-        <w:rPr>
-          <w:rFonts w:ascii="Courier New" w:hAnsi="Courier New" w:cs="Courier New"/>
-          <w:sz w:val="22"/>
-          <w:szCs w:val="22"/>
-        </w:rPr>
-        <w:t>$ENVIRONMENT_DIRECTORY</w:t>
-      </w:r>
-      <w:r>
-        <w:rPr>
-          <w:rFonts w:ascii="Courier New" w:hAnsi="Courier New" w:cs="Courier New"/>
-          <w:sz w:val="22"/>
-          <w:szCs w:val="22"/>
-        </w:rPr>
-        <w:t>/</w:t>
-      </w:r>
-      <w:proofErr w:type="spellStart"/>
-      <w:r>
-        <w:rPr>
-          <w:rFonts w:ascii="Courier New" w:hAnsi="Courier New" w:cs="Courier New"/>
-          <w:sz w:val="22"/>
-          <w:szCs w:val="22"/>
-        </w:rPr>
-        <w:t>app_data</w:t>
-      </w:r>
-      <w:proofErr w:type="spellEnd"/>
-      <w:r>
-        <w:rPr>
-          <w:rFonts w:ascii="Calibri" w:hAnsi="Calibri" w:cs="Calibri"/>
-        </w:rPr>
-        <w:t xml:space="preserve"> or the </w:t>
-      </w:r>
-      <w:r>
-        <w:rPr>
-          <w:rFonts w:ascii="Courier New" w:hAnsi="Courier New" w:cs="Courier New"/>
-          <w:sz w:val="22"/>
-          <w:szCs w:val="22"/>
-        </w:rPr>
-        <w:t>$ENVIRONMENT_DIRECTORY</w:t>
-      </w:r>
-      <w:r>
-        <w:rPr>
-          <w:rFonts w:ascii="Courier New" w:hAnsi="Courier New" w:cs="Courier New"/>
-          <w:sz w:val="22"/>
-          <w:szCs w:val="22"/>
-        </w:rPr>
-        <w:t xml:space="preserve">/provisioning </w:t>
-      </w:r>
-      <w:r>
-        <w:rPr>
-          <w:rFonts w:ascii="Calibri" w:hAnsi="Calibri" w:cs="Calibri"/>
-        </w:rPr>
-        <w:t>directories.</w:t>
-      </w:r>
-    </w:p>
-    <w:p>
-      <w:pPr>
-        <w:spacing w:after="0" w:line="240" w:lineRule="auto"/>
-        <w:rPr>
-          <w:rFonts w:ascii="Calibri" w:hAnsi="Calibri" w:cs="Calibri"/>
-        </w:rPr>
-      </w:pPr>
-    </w:p>
-    <w:p>
-      <w:pPr>
-        <w:spacing w:after="0" w:line="240" w:lineRule="auto"/>
-        <w:rPr>
-          <w:rFonts w:ascii="Calibri" w:hAnsi="Calibri" w:cs="Calibri"/>
-        </w:rPr>
-      </w:pPr>
-      <w:r>
-        <w:rPr>
-          <w:rFonts w:ascii="Calibri" w:hAnsi="Calibri" w:cs="Calibri"/>
-        </w:rPr>
-        <w:t xml:space="preserve">As with the </w:t>
-      </w:r>
-      <w:proofErr w:type="spellStart"/>
-      <w:r>
-        <w:rPr>
-          <w:rFonts w:ascii="Calibri" w:hAnsi="Calibri" w:cs="Calibri"/>
-          <w:i/>
-          <w:iCs/>
-        </w:rPr>
-        <w:t>simpleserver</w:t>
-      </w:r>
-      <w:proofErr w:type="spellEnd"/>
-      <w:r>
-        <w:rPr>
-          <w:rFonts w:ascii="Calibri" w:hAnsi="Calibri" w:cs="Calibri"/>
-        </w:rPr>
-        <w:t xml:space="preserve">, the deployment package for the </w:t>
-      </w:r>
-      <w:r>
-        <w:rPr>
-          <w:rFonts w:ascii="Calibri" w:hAnsi="Calibri" w:cs="Calibri"/>
-          <w:i/>
-          <w:iCs/>
-        </w:rPr>
-        <w:t>User in a deployed environment</w:t>
-      </w:r>
-      <w:r>
-        <w:rPr>
-          <w:rFonts w:ascii="Calibri" w:hAnsi="Calibri" w:cs="Calibri"/>
-          <w:i/>
-          <w:iCs/>
-        </w:rPr>
-        <w:t xml:space="preserve"> </w:t>
-      </w:r>
-      <w:r>
-        <w:rPr>
-          <w:rFonts w:ascii="Calibri" w:hAnsi="Calibri" w:cs="Calibri"/>
-        </w:rPr>
-        <w:t xml:space="preserve">can place the executable anywhere but </w:t>
-      </w:r>
-      <w:r>
-        <w:rPr>
-          <w:rFonts w:ascii="Courier New" w:hAnsi="Courier New" w:cs="Courier New"/>
-          <w:sz w:val="22"/>
-          <w:szCs w:val="22"/>
-        </w:rPr>
-        <w:t>$ENVIRONMENT_DIRECTORY</w:t>
-      </w:r>
-      <w:r>
-        <w:rPr>
-          <w:rFonts w:ascii="Calibri" w:hAnsi="Calibri" w:cs="Calibri"/>
-        </w:rPr>
-        <w:t xml:space="preserve"> is a convenient place.  During certification, </w:t>
-      </w:r>
-      <w:r>
-        <w:rPr>
-          <w:rFonts w:ascii="Courier New" w:hAnsi="Courier New" w:cs="Courier New"/>
-          <w:sz w:val="22"/>
-          <w:szCs w:val="22"/>
-        </w:rPr>
-        <w:t>$ENVIRONMENT_DIRECTORY</w:t>
-      </w:r>
-      <w:r>
-        <w:rPr>
-          <w:rFonts w:ascii="Courier New" w:hAnsi="Courier New" w:cs="Courier New"/>
-          <w:sz w:val="22"/>
-          <w:szCs w:val="22"/>
-        </w:rPr>
-        <w:t>/</w:t>
-      </w:r>
-      <w:proofErr w:type="spellStart"/>
-      <w:r>
-        <w:rPr>
-          <w:rFonts w:ascii="Courier New" w:hAnsi="Courier New" w:cs="Courier New"/>
-          <w:sz w:val="22"/>
-          <w:szCs w:val="22"/>
-        </w:rPr>
-        <w:t>app_data</w:t>
-      </w:r>
-      <w:proofErr w:type="spellEnd"/>
-      <w:r>
-        <w:rPr>
-          <w:rFonts w:ascii="Calibri" w:hAnsi="Calibri" w:cs="Calibri"/>
-        </w:rPr>
-        <w:t xml:space="preserve"> will contain the policy-store which protects application specific information in encry</w:t>
-      </w:r>
-      <w:r>
-        <w:rPr>
-          <w:rFonts w:ascii="Calibri" w:hAnsi="Calibri" w:cs="Calibri"/>
-        </w:rPr>
-        <w:t>pted form.</w:t>
-      </w:r>
-    </w:p>
-    <w:p>
-      <w:pPr>
-        <w:spacing w:after="0" w:line="240" w:lineRule="auto"/>
-        <w:rPr>
-          <w:rFonts w:ascii="Calibri" w:hAnsi="Calibri" w:cs="Calibri"/>
-        </w:rPr>
-      </w:pPr>
-    </w:p>
-    <w:p>
-      <w:pPr>
-        <w:spacing w:after="0" w:line="240" w:lineRule="auto"/>
-        <w:rPr>
-          <w:rFonts w:ascii="Calibri" w:hAnsi="Calibri" w:cs="Calibri"/>
-        </w:rPr>
-      </w:pPr>
-      <w:r>
-        <w:rPr>
-          <w:rFonts w:ascii="Calibri" w:hAnsi="Calibri" w:cs="Calibri"/>
-        </w:rPr>
-        <w:t xml:space="preserve">As a reminder, as deployed, the </w:t>
-      </w:r>
-      <w:r>
-        <w:rPr>
-          <w:rFonts w:ascii="Courier New" w:hAnsi="Courier New" w:cs="Courier New"/>
-          <w:sz w:val="22"/>
-          <w:szCs w:val="22"/>
-        </w:rPr>
-        <w:t>$ENVIRONMENT_DIRECTORY</w:t>
-      </w:r>
-      <w:r>
-        <w:rPr>
           <w:rFonts w:ascii="Calibri" w:hAnsi="Calibri" w:cs="Calibri"/>
         </w:rPr>
         <w:t xml:space="preserve"> need not be protected, just accessible.</w:t>
@@ -1358,8 +1212,6 @@
       <w:r>
         <w:rPr>
           <w:rFonts w:ascii="Courier New" w:hAnsi="Courier New" w:cs="Courier New"/>
-          <w:sz w:val="22"/>
-          <w:szCs w:val="22"/>
         </w:rPr>
         <w:t>$ENVIRONMENT_DIRECTORY</w:t>
       </w:r>
@@ -1415,7 +1267,19 @@
         <w:rPr>
           <w:rFonts w:ascii="Calibri" w:hAnsi="Calibri" w:cs="Calibri"/>
         </w:rPr>
-        <w:t xml:space="preserve">For VM’s. the story is very slightly different; the </w:t>
+        <w:t>For VM’s</w:t>
+      </w:r>
+      <w:r>
+        <w:rPr>
+          <w:rFonts w:ascii="Calibri" w:hAnsi="Calibri" w:cs="Calibri"/>
+        </w:rPr>
+        <w:t>,</w:t>
+      </w:r>
+      <w:r>
+        <w:rPr>
+          <w:rFonts w:ascii="Calibri" w:hAnsi="Calibri" w:cs="Calibri"/>
+        </w:rPr>
+        <w:t xml:space="preserve"> the story is very slightly different; the </w:t>
       </w:r>
       <w:r>
         <w:rPr>
@@ -1432,8 +1296,6 @@
       <w:r>
         <w:rPr>
           <w:rFonts w:ascii="Courier New" w:hAnsi="Courier New" w:cs="Courier New"/>
-          <w:sz w:val="22"/>
-          <w:szCs w:val="22"/>
         </w:rPr>
         <w:t>$ENVIRONMENT_DIRECTORY</w:t>
       </w:r>
@@ -1473,21 +1335,36 @@
           <w:i/>
           <w:iCs/>
         </w:rPr>
-        <w:t>Application developer</w:t>
-      </w:r>
-      <w:r>
-        <w:rPr>
-          <w:rFonts w:ascii="Calibri" w:hAnsi="Calibri" w:cs="Calibri"/>
-          <w:i/>
-          <w:iCs/>
-        </w:rPr>
-        <w:t xml:space="preserve"> </w:t>
-      </w:r>
-      <w:r>
-        <w:rPr>
-          <w:rFonts w:ascii="Calibri" w:hAnsi="Calibri" w:cs="Calibri"/>
-        </w:rPr>
-        <w:t xml:space="preserve">role on a VM.  The </w:t>
+        <w:t xml:space="preserve">Application developer </w:t>
+      </w:r>
+      <w:r>
+        <w:rPr>
+          <w:rFonts w:ascii="Calibri" w:hAnsi="Calibri" w:cs="Calibri"/>
+        </w:rPr>
+        <w:t>role on a VM.</w:t>
+      </w:r>
+    </w:p>
+    <w:p>
+      <w:pPr>
+        <w:spacing w:after="0" w:line="240" w:lineRule="auto"/>
+        <w:rPr>
+          <w:rFonts w:ascii="Calibri" w:hAnsi="Calibri" w:cs="Calibri"/>
+        </w:rPr>
+      </w:pPr>
+    </w:p>
+    <w:p>
+      <w:pPr>
+        <w:spacing w:after="0" w:line="240" w:lineRule="auto"/>
+        <w:rPr>
+          <w:rFonts w:ascii="Calibri" w:hAnsi="Calibri" w:cs="Calibri"/>
+        </w:rPr>
+      </w:pPr>
+      <w:r>
+        <w:rPr>
+          <w:rFonts w:ascii="Calibri" w:hAnsi="Calibri" w:cs="Calibri"/>
+        </w:rPr>
+        <w:lastRenderedPageBreak/>
+        <w:t xml:space="preserve">The </w:t>
       </w:r>
       <w:r>
         <w:rPr>
@@ -1542,7 +1419,6 @@
         <w:rPr>
           <w:rFonts w:ascii="Calibri" w:hAnsi="Calibri" w:cs="Calibri"/>
         </w:rPr>
-        <w:lastRenderedPageBreak/>
         <w:t>The executables for the certifier (</w:t>
       </w:r>
       <w:proofErr w:type="spellStart"/>
@@ -1578,16 +1454,12 @@
       <w:r>
         <w:rPr>
           <w:rFonts w:ascii="Courier New" w:hAnsi="Courier New" w:cs="Courier New"/>
-          <w:sz w:val="22"/>
-          <w:szCs w:val="22"/>
         </w:rPr>
         <w:t>$ENVIRONMENT_DIRECTORY</w:t>
       </w:r>
       <w:r>
         <w:rPr>
           <w:rFonts w:ascii="Courier New" w:hAnsi="Courier New" w:cs="Courier New"/>
-          <w:sz w:val="22"/>
-          <w:szCs w:val="22"/>
         </w:rPr>
         <w:t xml:space="preserve"> </w:t>
       </w:r>
@@ -1603,15 +1475,7 @@
           <w:i/>
           <w:iCs/>
         </w:rPr>
-        <w:t>Security domain administrator</w:t>
-      </w:r>
-      <w:r>
-        <w:rPr>
-          <w:rFonts w:ascii="Calibri" w:hAnsi="Calibri" w:cs="Calibri"/>
-          <w:i/>
-          <w:iCs/>
-        </w:rPr>
-        <w:t xml:space="preserve"> </w:t>
+        <w:t xml:space="preserve">Security domain administrator </w:t>
       </w:r>
       <w:r>
         <w:rPr>
@@ -1683,15 +1547,7 @@
           <w:i/>
           <w:iCs/>
         </w:rPr>
-        <w:t>User in a deployed environment</w:t>
-      </w:r>
-      <w:r>
-        <w:rPr>
-          <w:rFonts w:ascii="Calibri" w:hAnsi="Calibri" w:cs="Calibri"/>
-          <w:i/>
-          <w:iCs/>
-        </w:rPr>
-        <w:t>,</w:t>
+        <w:t>User in a deployed environment,</w:t>
       </w:r>
       <w:r>
         <w:rPr>
@@ -1702,8 +1558,6 @@
       <w:r>
         <w:rPr>
           <w:rFonts w:ascii="Courier New" w:hAnsi="Courier New" w:cs="Courier New"/>
-          <w:sz w:val="22"/>
-          <w:szCs w:val="22"/>
         </w:rPr>
         <w:t>$ENVIRONMENT_DIRECTORY</w:t>
       </w:r>
@@ -1722,25 +1576,13 @@
       <w:r>
         <w:rPr>
           <w:rFonts w:ascii="Courier New" w:hAnsi="Courier New" w:cs="Courier New"/>
-          <w:sz w:val="22"/>
-          <w:szCs w:val="22"/>
-        </w:rPr>
-        <w:t>$ENVIRONMENT_DIRECTORY</w:t>
-      </w:r>
-      <w:r>
-        <w:rPr>
-          <w:rFonts w:ascii="Courier New" w:hAnsi="Courier New" w:cs="Courier New"/>
-          <w:sz w:val="22"/>
-          <w:szCs w:val="22"/>
-        </w:rPr>
-        <w:t>/</w:t>
+        </w:rPr>
+        <w:t>$ENVIRONMENT_DIRECTORY/</w:t>
       </w:r>
       <w:proofErr w:type="spellStart"/>
       <w:r>
         <w:rPr>
           <w:rFonts w:ascii="Courier New" w:hAnsi="Courier New" w:cs="Courier New"/>
-          <w:sz w:val="22"/>
-          <w:szCs w:val="22"/>
         </w:rPr>
         <w:t>cf_data</w:t>
       </w:r>
@@ -1748,17 +1590,25 @@
       <w:r>
         <w:rPr>
           <w:rFonts w:ascii="Calibri" w:hAnsi="Calibri" w:cs="Calibri"/>
-          <w:sz w:val="22"/>
-          <w:szCs w:val="22"/>
-        </w:rPr>
-        <w:t xml:space="preserve">, this directory will contain copies of the arc, ask and </w:t>
+        </w:rPr>
+        <w:t>, this directory will contain copies of the ar</w:t>
+      </w:r>
+      <w:r>
+        <w:rPr>
+          <w:rFonts w:ascii="Calibri" w:hAnsi="Calibri" w:cs="Calibri"/>
+        </w:rPr>
+        <w:t>k</w:t>
+      </w:r>
+      <w:r>
+        <w:rPr>
+          <w:rFonts w:ascii="Calibri" w:hAnsi="Calibri" w:cs="Calibri"/>
+        </w:rPr>
+        <w:t xml:space="preserve">, ask and </w:t>
       </w:r>
       <w:proofErr w:type="spellStart"/>
       <w:r>
         <w:rPr>
           <w:rFonts w:ascii="Calibri" w:hAnsi="Calibri" w:cs="Calibri"/>
-          <w:sz w:val="22"/>
-          <w:szCs w:val="22"/>
         </w:rPr>
         <w:t>vcert</w:t>
       </w:r>
@@ -1766,8 +1616,6 @@
       <w:r>
         <w:rPr>
           <w:rFonts w:ascii="Calibri" w:hAnsi="Calibri" w:cs="Calibri"/>
-          <w:sz w:val="22"/>
-          <w:szCs w:val="22"/>
         </w:rPr>
         <w:t xml:space="preserve"> certs, in the </w:t>
       </w:r>
@@ -1775,8 +1623,6 @@
       <w:r>
         <w:rPr>
           <w:rFonts w:ascii="Calibri" w:hAnsi="Calibri" w:cs="Calibri"/>
-          <w:sz w:val="22"/>
-          <w:szCs w:val="22"/>
         </w:rPr>
         <w:t>sev</w:t>
       </w:r>
@@ -1784,8 +1630,6 @@
       <w:r>
         <w:rPr>
           <w:rFonts w:ascii="Calibri" w:hAnsi="Calibri" w:cs="Calibri"/>
-          <w:sz w:val="22"/>
-          <w:szCs w:val="22"/>
         </w:rPr>
         <w:t xml:space="preserve"> case, the simulated enclave files, and the endorsement cert (in the </w:t>
       </w:r>
@@ -1793,8 +1637,6 @@
       <w:r>
         <w:rPr>
           <w:rFonts w:ascii="Calibri" w:hAnsi="Calibri" w:cs="Calibri"/>
-          <w:sz w:val="22"/>
-          <w:szCs w:val="22"/>
         </w:rPr>
         <w:t>tpm</w:t>
       </w:r>
@@ -1802,8 +1644,6 @@
       <w:r>
         <w:rPr>
           <w:rFonts w:ascii="Calibri" w:hAnsi="Calibri" w:cs="Calibri"/>
-          <w:sz w:val="22"/>
-          <w:szCs w:val="22"/>
         </w:rPr>
         <w:t xml:space="preserve"> case).</w:t>
       </w:r>
@@ -1823,56 +1663,30 @@
       <w:r>
         <w:rPr>
           <w:rFonts w:ascii="Calibri" w:hAnsi="Calibri" w:cs="Calibri"/>
-          <w:sz w:val="22"/>
-          <w:szCs w:val="22"/>
         </w:rPr>
         <w:t xml:space="preserve">The </w:t>
       </w:r>
       <w:r>
         <w:rPr>
           <w:rFonts w:ascii="Courier New" w:hAnsi="Courier New" w:cs="Courier New"/>
-          <w:sz w:val="22"/>
-          <w:szCs w:val="22"/>
-        </w:rPr>
-        <w:t>$ENVIRONMENT_DIRECTORY</w:t>
-      </w:r>
-      <w:r>
-        <w:rPr>
-          <w:rFonts w:ascii="Courier New" w:hAnsi="Courier New" w:cs="Courier New"/>
-          <w:sz w:val="22"/>
-          <w:szCs w:val="22"/>
-        </w:rPr>
-        <w:t>/provisioning</w:t>
-      </w:r>
-      <w:r>
-        <w:rPr>
-          <w:rFonts w:ascii="Calibri" w:hAnsi="Calibri" w:cs="Calibri"/>
-          <w:sz w:val="22"/>
-          <w:szCs w:val="22"/>
+        </w:rPr>
+        <w:t>$ENVIRONMENT_DIRECTORY/provisioning</w:t>
+      </w:r>
+      <w:r>
+        <w:rPr>
+          <w:rFonts w:ascii="Calibri" w:hAnsi="Calibri" w:cs="Calibri"/>
         </w:rPr>
         <w:t xml:space="preserve"> and </w:t>
       </w:r>
       <w:r>
         <w:rPr>
           <w:rFonts w:ascii="Courier New" w:hAnsi="Courier New" w:cs="Courier New"/>
-          <w:sz w:val="22"/>
-          <w:szCs w:val="22"/>
-        </w:rPr>
-        <w:t>$ENVIRONMENT_DIRECTORY</w:t>
-      </w:r>
-      <w:r>
-        <w:rPr>
-          <w:rFonts w:ascii="Courier New" w:hAnsi="Courier New" w:cs="Courier New"/>
-          <w:sz w:val="22"/>
-          <w:szCs w:val="22"/>
-        </w:rPr>
-        <w:t>/service</w:t>
-      </w:r>
-      <w:r>
-        <w:rPr>
-          <w:rFonts w:ascii="Calibri" w:hAnsi="Calibri" w:cs="Calibri"/>
-          <w:sz w:val="22"/>
-          <w:szCs w:val="22"/>
+        </w:rPr>
+        <w:t>$ENVIRONMENT_DIRECTORY/service</w:t>
+      </w:r>
+      <w:r>
+        <w:rPr>
+          <w:rFonts w:ascii="Calibri" w:hAnsi="Calibri" w:cs="Calibri"/>
         </w:rPr>
         <w:t xml:space="preserve"> directories are exactly as in the application setting and should </w:t>
       </w:r>
@@ -1880,8 +1694,6 @@
       <w:r>
         <w:rPr>
           <w:rFonts w:ascii="Calibri" w:hAnsi="Calibri" w:cs="Calibri"/>
-          <w:sz w:val="22"/>
-          <w:szCs w:val="22"/>
         </w:rPr>
         <w:t>absolutely not</w:t>
       </w:r>
@@ -1889,8 +1701,6 @@
       <w:r>
         <w:rPr>
           <w:rFonts w:ascii="Calibri" w:hAnsi="Calibri" w:cs="Calibri"/>
-          <w:sz w:val="22"/>
-          <w:szCs w:val="22"/>
         </w:rPr>
         <w:t xml:space="preserve"> be distributed to the </w:t>
       </w:r>
@@ -1924,8 +1734,6 @@
       <w:r>
         <w:rPr>
           <w:rFonts w:ascii="Calibri" w:hAnsi="Calibri" w:cs="Calibri"/>
-          <w:sz w:val="22"/>
-          <w:szCs w:val="22"/>
         </w:rPr>
         <w:t xml:space="preserve">As before, the </w:t>
       </w:r>
@@ -1935,15 +1743,7 @@
           <w:i/>
           <w:iCs/>
         </w:rPr>
-        <w:t>Security domain administrator</w:t>
-      </w:r>
-      <w:r>
-        <w:rPr>
-          <w:rFonts w:ascii="Calibri" w:hAnsi="Calibri" w:cs="Calibri"/>
-          <w:i/>
-          <w:iCs/>
-        </w:rPr>
-        <w:t xml:space="preserve">, </w:t>
+        <w:t xml:space="preserve">Security domain administrator, </w:t>
       </w:r>
       <w:r>
         <w:rPr>
@@ -1954,32 +1754,14 @@
       <w:r>
         <w:rPr>
           <w:rFonts w:ascii="Courier New" w:hAnsi="Courier New" w:cs="Courier New"/>
-          <w:sz w:val="22"/>
-          <w:szCs w:val="22"/>
-        </w:rPr>
-        <w:t>$ENVIRONMENT_DIRECTORY</w:t>
-      </w:r>
-      <w:r>
-        <w:rPr>
-          <w:rFonts w:ascii="Courier New" w:hAnsi="Courier New" w:cs="Courier New"/>
-          <w:sz w:val="22"/>
-          <w:szCs w:val="22"/>
-        </w:rPr>
-        <w:t>/provisioning</w:t>
-      </w:r>
-      <w:r>
-        <w:rPr>
-          <w:rFonts w:ascii="Calibri" w:hAnsi="Calibri" w:cs="Calibri"/>
-          <w:sz w:val="22"/>
-          <w:szCs w:val="22"/>
-        </w:rPr>
-        <w:t xml:space="preserve"> directory </w:t>
-      </w:r>
-      <w:r>
-        <w:rPr>
-          <w:rFonts w:ascii="Calibri" w:hAnsi="Calibri" w:cs="Calibri"/>
-        </w:rPr>
-        <w:t>to store generated keys and policy.</w:t>
+        </w:rPr>
+        <w:t>$ENVIRONMENT_DIRECTORY/provisioning</w:t>
+      </w:r>
+      <w:r>
+        <w:rPr>
+          <w:rFonts w:ascii="Calibri" w:hAnsi="Calibri" w:cs="Calibri"/>
+        </w:rPr>
+        <w:t xml:space="preserve"> directory to store generated keys and policy.</w:t>
       </w:r>
     </w:p>
     <w:p>
@@ -2017,7 +1799,19 @@
         <w:rPr>
           <w:rFonts w:ascii="Calibri" w:hAnsi="Calibri" w:cs="Calibri"/>
         </w:rPr>
-        <w:t>The utilities (</w:t>
+        <w:t xml:space="preserve">The </w:t>
+      </w:r>
+      <w:r>
+        <w:rPr>
+          <w:rFonts w:ascii="Calibri" w:hAnsi="Calibri" w:cs="Calibri"/>
+        </w:rPr>
+        <w:t xml:space="preserve">VM </w:t>
+      </w:r>
+      <w:r>
+        <w:rPr>
+          <w:rFonts w:ascii="Calibri" w:hAnsi="Calibri" w:cs="Calibri"/>
+        </w:rPr>
+        <w:t>utilities (</w:t>
       </w:r>
       <w:proofErr w:type="spellStart"/>
       <w:r>
@@ -2046,25 +1840,13 @@
       <w:r>
         <w:rPr>
           <w:rFonts w:ascii="Courier New" w:hAnsi="Courier New" w:cs="Courier New"/>
-          <w:sz w:val="22"/>
-          <w:szCs w:val="22"/>
-        </w:rPr>
-        <w:t>$ENVIRONMENT_DIRECTORY</w:t>
-      </w:r>
-      <w:r>
-        <w:rPr>
-          <w:rFonts w:ascii="Courier New" w:hAnsi="Courier New" w:cs="Courier New"/>
-          <w:sz w:val="22"/>
-          <w:szCs w:val="22"/>
-        </w:rPr>
-        <w:t>/</w:t>
+        </w:rPr>
+        <w:t>$ENVIRONMENT_DIRECTORY/</w:t>
       </w:r>
       <w:proofErr w:type="spellStart"/>
       <w:r>
         <w:rPr>
           <w:rFonts w:ascii="Courier New" w:hAnsi="Courier New" w:cs="Courier New"/>
-          <w:sz w:val="22"/>
-          <w:szCs w:val="22"/>
         </w:rPr>
         <w:t>cf_data</w:t>
       </w:r>
@@ -2129,49 +1911,25 @@
       <w:r>
         <w:rPr>
           <w:rFonts w:ascii="Courier New" w:hAnsi="Courier New" w:cs="Courier New"/>
-          <w:sz w:val="22"/>
-          <w:szCs w:val="22"/>
-        </w:rPr>
-        <w:t>$ENVIRONMENT_DIRECTORY</w:t>
-      </w:r>
-      <w:r>
-        <w:rPr>
-          <w:rFonts w:ascii="Courier New" w:hAnsi="Courier New" w:cs="Courier New"/>
-          <w:sz w:val="22"/>
-          <w:szCs w:val="22"/>
-        </w:rPr>
-        <w:t xml:space="preserve"> </w:t>
-      </w:r>
-      <w:r>
-        <w:rPr>
-          <w:rFonts w:ascii="Calibri" w:hAnsi="Calibri" w:cs="Calibri"/>
-          <w:sz w:val="22"/>
-          <w:szCs w:val="22"/>
+        </w:rPr>
+        <w:t xml:space="preserve">$ENVIRONMENT_DIRECTORY </w:t>
+      </w:r>
+      <w:r>
+        <w:rPr>
+          <w:rFonts w:ascii="Calibri" w:hAnsi="Calibri" w:cs="Calibri"/>
         </w:rPr>
         <w:t xml:space="preserve">and </w:t>
       </w:r>
       <w:r>
         <w:rPr>
           <w:rFonts w:ascii="Courier New" w:hAnsi="Courier New" w:cs="Courier New"/>
-          <w:sz w:val="22"/>
-          <w:szCs w:val="22"/>
-        </w:rPr>
-        <w:t>$ENVIRONMENT_DIRECTORY</w:t>
-      </w:r>
-      <w:r>
-        <w:rPr>
-          <w:rFonts w:ascii="Courier New" w:hAnsi="Courier New" w:cs="Courier New"/>
-          <w:sz w:val="22"/>
-          <w:szCs w:val="22"/>
-        </w:rPr>
-        <w:t>/</w:t>
+        </w:rPr>
+        <w:t>$ENVIRONMENT_DIRECTORY/</w:t>
       </w:r>
       <w:proofErr w:type="spellStart"/>
       <w:r>
         <w:rPr>
           <w:rFonts w:ascii="Courier New" w:hAnsi="Courier New" w:cs="Courier New"/>
-          <w:sz w:val="22"/>
-          <w:szCs w:val="22"/>
         </w:rPr>
         <w:t>cf_data</w:t>
       </w:r>
@@ -2204,8 +1962,6 @@
       <w:r>
         <w:rPr>
           <w:rFonts w:ascii="Courier New" w:hAnsi="Courier New" w:cs="Courier New"/>
-          <w:sz w:val="22"/>
-          <w:szCs w:val="22"/>
         </w:rPr>
         <w:t>$ENVIRONMENT_DIRECTORY</w:t>
       </w:r>
@@ -2361,29 +2117,38 @@
         <w:rPr>
           <w:rFonts w:ascii="Calibri" w:hAnsi="Calibri" w:cs="Calibri"/>
         </w:rPr>
-        <w:t xml:space="preserve">) for individual applications and depends on the OS for isolation among such apps.  In this case, there will be (at least) three separate </w:t>
-      </w:r>
-      <w:r>
-        <w:rPr>
-          <w:rFonts w:ascii="Courier New" w:hAnsi="Courier New" w:cs="Courier New"/>
-          <w:sz w:val="22"/>
-          <w:szCs w:val="22"/>
-        </w:rPr>
-        <w:t>$ENVIRONMENT_DIRECTORY</w:t>
-      </w:r>
-      <w:r>
-        <w:rPr>
-          <w:rFonts w:ascii="Courier New" w:hAnsi="Courier New" w:cs="Courier New"/>
-          <w:sz w:val="22"/>
-          <w:szCs w:val="22"/>
+        <w:t xml:space="preserve">) for individual applications and depends on the OS for isolation among such apps.  In this case, there </w:t>
+      </w:r>
+      <w:r>
+        <w:rPr>
+          <w:rFonts w:ascii="Calibri" w:hAnsi="Calibri" w:cs="Calibri"/>
+        </w:rPr>
+        <w:lastRenderedPageBreak/>
+        <w:t xml:space="preserve">will be (at least) three </w:t>
+      </w:r>
+      <w:proofErr w:type="gramStart"/>
+      <w:r>
+        <w:rPr>
+          <w:rFonts w:ascii="Calibri" w:hAnsi="Calibri" w:cs="Calibri"/>
+        </w:rPr>
+        <w:t>separate</w:t>
+      </w:r>
+      <w:proofErr w:type="gramEnd"/>
+      <w:r>
+        <w:rPr>
+          <w:rFonts w:ascii="Calibri" w:hAnsi="Calibri" w:cs="Calibri"/>
         </w:rPr>
         <w:t xml:space="preserve"> </w:t>
       </w:r>
       <w:r>
         <w:rPr>
-          <w:rFonts w:ascii="Calibri" w:hAnsi="Calibri" w:cs="Calibri"/>
-          <w:sz w:val="22"/>
-          <w:szCs w:val="22"/>
+          <w:rFonts w:ascii="Courier New" w:hAnsi="Courier New" w:cs="Courier New"/>
+        </w:rPr>
+        <w:t xml:space="preserve">$ENVIRONMENT_DIRECTORY </w:t>
+      </w:r>
+      <w:r>
+        <w:rPr>
+          <w:rFonts w:ascii="Calibri" w:hAnsi="Calibri" w:cs="Calibri"/>
         </w:rPr>
         <w:t>locations: one for the VM, one for the application service and one for each protected application.</w:t>
       </w:r>

</xml_diff>